<commit_message>
fix: add mime_type to konsultasi_skripsi_review_file, target skripsi update by id, and validate pengajuan-sidang-kaprodi fields
</commit_message>
<xml_diff>
--- a/src/templates/template_kartu_penulisan_skripsi.docx
+++ b/src/templates/template_kartu_penulisan_skripsi.docx
@@ -1339,7 +1339,7 @@
       </w:tblGrid>
       <w:tr>
         <w:trPr>
-          <w:trHeight w:hRule="exact" w:val="369"/>
+          <w:trHeight w:hRule="atLeast" w:val="369"/>
           <w:jc w:val="center"/>
         </w:trPr>
         <w:tc>
@@ -1417,7 +1417,7 @@
       </w:tr>
       <w:tr>
         <w:trPr>
-          <w:trHeight w:hRule="exact" w:val="425"/>
+          <w:trHeight w:hRule="atLeast" w:val="425"/>
           <w:jc w:val="center"/>
         </w:trPr>
         <w:tc>
@@ -1495,7 +1495,7 @@
       </w:tr>
       <w:tr>
         <w:trPr>
-          <w:trHeight w:hRule="exact" w:val="425"/>
+          <w:trHeight w:hRule="atLeast" w:val="425"/>
           <w:jc w:val="center"/>
         </w:trPr>
         <w:tc>
@@ -1573,7 +1573,7 @@
       </w:tr>
       <w:tr>
         <w:trPr>
-          <w:trHeight w:hRule="exact" w:val="425"/>
+          <w:trHeight w:hRule="atLeast" w:val="425"/>
           <w:jc w:val="center"/>
         </w:trPr>
         <w:tc>
@@ -1651,7 +1651,7 @@
       </w:tr>
       <w:tr>
         <w:trPr>
-          <w:trHeight w:hRule="exact" w:val="425"/>
+          <w:trHeight w:hRule="atLeast" w:val="425"/>
           <w:jc w:val="center"/>
         </w:trPr>
         <w:tc>
@@ -1729,7 +1729,7 @@
       </w:tr>
       <w:tr>
         <w:trPr>
-          <w:trHeight w:hRule="exact" w:val="425"/>
+          <w:trHeight w:hRule="atLeast" w:val="425"/>
           <w:jc w:val="center"/>
         </w:trPr>
         <w:tc>
@@ -1807,7 +1807,7 @@
       </w:tr>
       <w:tr>
         <w:trPr>
-          <w:trHeight w:hRule="exact" w:val="425"/>
+          <w:trHeight w:hRule="atLeast" w:val="425"/>
           <w:jc w:val="center"/>
         </w:trPr>
         <w:tc>
@@ -1885,7 +1885,7 @@
       </w:tr>
       <w:tr>
         <w:trPr>
-          <w:trHeight w:hRule="exact" w:val="425"/>
+          <w:trHeight w:hRule="atLeast" w:val="425"/>
           <w:jc w:val="center"/>
         </w:trPr>
         <w:tc>
@@ -1963,7 +1963,7 @@
       </w:tr>
       <w:tr>
         <w:trPr>
-          <w:trHeight w:hRule="exact" w:val="425"/>
+          <w:trHeight w:hRule="atLeast" w:val="425"/>
           <w:jc w:val="center"/>
         </w:trPr>
         <w:tc>
@@ -2041,7 +2041,7 @@
       </w:tr>
       <w:tr>
         <w:trPr>
-          <w:trHeight w:hRule="exact" w:val="425"/>
+          <w:trHeight w:hRule="atLeast" w:val="425"/>
           <w:jc w:val="center"/>
         </w:trPr>
         <w:tc>
@@ -2119,7 +2119,7 @@
       </w:tr>
       <w:tr>
         <w:trPr>
-          <w:trHeight w:hRule="exact" w:val="425"/>
+          <w:trHeight w:hRule="atLeast" w:val="425"/>
           <w:jc w:val="center"/>
         </w:trPr>
         <w:tc>
@@ -2197,7 +2197,7 @@
       </w:tr>
       <w:tr>
         <w:trPr>
-          <w:trHeight w:hRule="exact" w:val="425"/>
+          <w:trHeight w:hRule="atLeast" w:val="425"/>
           <w:jc w:val="center"/>
         </w:trPr>
         <w:tc>
@@ -2275,7 +2275,7 @@
       </w:tr>
       <w:tr>
         <w:trPr>
-          <w:trHeight w:hRule="exact" w:val="425"/>
+          <w:trHeight w:hRule="atLeast" w:val="425"/>
           <w:jc w:val="center"/>
         </w:trPr>
         <w:tc>
@@ -2353,7 +2353,7 @@
       </w:tr>
       <w:tr>
         <w:trPr>
-          <w:trHeight w:hRule="exact" w:val="425"/>
+          <w:trHeight w:hRule="atLeast" w:val="425"/>
           <w:jc w:val="center"/>
         </w:trPr>
         <w:tc>
@@ -2431,7 +2431,7 @@
       </w:tr>
       <w:tr>
         <w:trPr>
-          <w:trHeight w:hRule="exact" w:val="425"/>
+          <w:trHeight w:hRule="atLeast" w:val="425"/>
           <w:jc w:val="center"/>
         </w:trPr>
         <w:tc>
@@ -2509,7 +2509,7 @@
       </w:tr>
       <w:tr>
         <w:trPr>
-          <w:trHeight w:hRule="exact" w:val="425"/>
+          <w:trHeight w:hRule="atLeast" w:val="425"/>
           <w:jc w:val="center"/>
         </w:trPr>
         <w:tc>
@@ -2587,7 +2587,7 @@
       </w:tr>
       <w:tr>
         <w:trPr>
-          <w:trHeight w:hRule="exact" w:val="425"/>
+          <w:trHeight w:hRule="atLeast" w:val="425"/>
           <w:jc w:val="center"/>
         </w:trPr>
         <w:tc>
@@ -2665,7 +2665,7 @@
       </w:tr>
       <w:tr>
         <w:trPr>
-          <w:trHeight w:hRule="exact" w:val="425"/>
+          <w:trHeight w:hRule="atLeast" w:val="425"/>
           <w:jc w:val="center"/>
         </w:trPr>
         <w:tc>
@@ -2743,7 +2743,7 @@
       </w:tr>
       <w:tr>
         <w:trPr>
-          <w:trHeight w:hRule="exact" w:val="425"/>
+          <w:trHeight w:hRule="atLeast" w:val="425"/>
           <w:jc w:val="center"/>
         </w:trPr>
         <w:tc>
@@ -2821,7 +2821,7 @@
       </w:tr>
       <w:tr>
         <w:trPr>
-          <w:trHeight w:hRule="exact" w:val="425"/>
+          <w:trHeight w:hRule="atLeast" w:val="425"/>
           <w:jc w:val="center"/>
         </w:trPr>
         <w:tc>
@@ -2945,7 +2945,7 @@
       </w:tr>
       <w:tr>
         <w:trPr>
-          <w:trHeight w:hRule="exact" w:val="425"/>
+          <w:trHeight w:hRule="atLeast" w:val="425"/>
           <w:jc w:val="center"/>
         </w:trPr>
         <w:tc>
@@ -3068,7 +3068,7 @@
       </w:tr>
       <w:tr>
         <w:trPr>
-          <w:trHeight w:hRule="exact" w:val="425"/>
+          <w:trHeight w:hRule="atLeast" w:val="425"/>
           <w:jc w:val="center"/>
         </w:trPr>
         <w:tc>
@@ -3191,7 +3191,7 @@
       </w:tr>
       <w:tr>
         <w:trPr>
-          <w:trHeight w:hRule="exact" w:val="425"/>
+          <w:trHeight w:hRule="atLeast" w:val="425"/>
           <w:jc w:val="center"/>
         </w:trPr>
         <w:tc>
@@ -3314,7 +3314,7 @@
       </w:tr>
       <w:tr>
         <w:trPr>
-          <w:trHeight w:hRule="exact" w:val="425"/>
+          <w:trHeight w:hRule="atLeast" w:val="425"/>
           <w:jc w:val="center"/>
         </w:trPr>
         <w:tc>
@@ -3437,7 +3437,7 @@
       </w:tr>
       <w:tr>
         <w:trPr>
-          <w:trHeight w:hRule="exact" w:val="425"/>
+          <w:trHeight w:hRule="atLeast" w:val="425"/>
           <w:jc w:val="center"/>
         </w:trPr>
         <w:tc>
@@ -3560,7 +3560,7 @@
       </w:tr>
       <w:tr>
         <w:trPr>
-          <w:trHeight w:hRule="exact" w:val="425"/>
+          <w:trHeight w:hRule="atLeast" w:val="425"/>
           <w:jc w:val="center"/>
         </w:trPr>
         <w:tc>
@@ -3683,7 +3683,7 @@
       </w:tr>
       <w:tr>
         <w:trPr>
-          <w:trHeight w:hRule="exact" w:val="425"/>
+          <w:trHeight w:hRule="atLeast" w:val="425"/>
           <w:jc w:val="center"/>
         </w:trPr>
         <w:tc>
@@ -3806,7 +3806,7 @@
       </w:tr>
       <w:tr>
         <w:trPr>
-          <w:trHeight w:hRule="exact" w:val="425"/>
+          <w:trHeight w:hRule="atLeast" w:val="425"/>
           <w:jc w:val="center"/>
         </w:trPr>
         <w:tc>
@@ -3929,7 +3929,7 @@
       </w:tr>
       <w:tr>
         <w:trPr>
-          <w:trHeight w:hRule="exact" w:val="425"/>
+          <w:trHeight w:hRule="atLeast" w:val="425"/>
           <w:jc w:val="center"/>
         </w:trPr>
         <w:tc>
@@ -4052,7 +4052,7 @@
       </w:tr>
       <w:tr>
         <w:trPr>
-          <w:trHeight w:hRule="exact" w:val="425"/>
+          <w:trHeight w:hRule="atLeast" w:val="425"/>
           <w:jc w:val="center"/>
         </w:trPr>
         <w:tc>
@@ -4175,7 +4175,7 @@
       </w:tr>
       <w:tr>
         <w:trPr>
-          <w:trHeight w:hRule="exact" w:val="425"/>
+          <w:trHeight w:hRule="atLeast" w:val="425"/>
           <w:jc w:val="center"/>
         </w:trPr>
         <w:tc>
@@ -4298,7 +4298,7 @@
       </w:tr>
       <w:tr>
         <w:trPr>
-          <w:trHeight w:hRule="exact" w:val="425"/>
+          <w:trHeight w:hRule="atLeast" w:val="425"/>
           <w:jc w:val="center"/>
         </w:trPr>
         <w:tc>
@@ -4421,7 +4421,7 @@
       </w:tr>
       <w:tr>
         <w:trPr>
-          <w:trHeight w:hRule="exact" w:val="425"/>
+          <w:trHeight w:hRule="atLeast" w:val="425"/>
           <w:jc w:val="center"/>
         </w:trPr>
         <w:tc>
@@ -4544,7 +4544,7 @@
       </w:tr>
       <w:tr>
         <w:trPr>
-          <w:trHeight w:hRule="exact" w:val="425"/>
+          <w:trHeight w:hRule="atLeast" w:val="425"/>
           <w:jc w:val="center"/>
         </w:trPr>
         <w:tc>
@@ -4667,7 +4667,7 @@
       </w:tr>
       <w:tr>
         <w:trPr>
-          <w:trHeight w:hRule="exact" w:val="425"/>
+          <w:trHeight w:hRule="atLeast" w:val="425"/>
           <w:jc w:val="center"/>
         </w:trPr>
         <w:tc>
@@ -4790,7 +4790,7 @@
       </w:tr>
       <w:tr>
         <w:trPr>
-          <w:trHeight w:hRule="exact" w:val="425"/>
+          <w:trHeight w:hRule="atLeast" w:val="425"/>
           <w:jc w:val="center"/>
         </w:trPr>
         <w:tc>
@@ -4913,7 +4913,7 @@
       </w:tr>
       <w:tr>
         <w:trPr>
-          <w:trHeight w:hRule="exact" w:val="425"/>
+          <w:trHeight w:hRule="atLeast" w:val="425"/>
           <w:jc w:val="center"/>
         </w:trPr>
         <w:tc>
@@ -5036,7 +5036,7 @@
       </w:tr>
       <w:tr>
         <w:trPr>
-          <w:trHeight w:hRule="exact" w:val="425"/>
+          <w:trHeight w:hRule="atLeast" w:val="425"/>
           <w:jc w:val="center"/>
         </w:trPr>
         <w:tc>
@@ -5159,7 +5159,7 @@
       </w:tr>
       <w:tr>
         <w:trPr>
-          <w:trHeight w:hRule="exact" w:val="425"/>
+          <w:trHeight w:hRule="atLeast" w:val="425"/>
           <w:jc w:val="center"/>
         </w:trPr>
         <w:tc>
@@ -5282,7 +5282,7 @@
       </w:tr>
       <w:tr>
         <w:trPr>
-          <w:trHeight w:hRule="exact" w:val="425"/>
+          <w:trHeight w:hRule="atLeast" w:val="425"/>
           <w:jc w:val="center"/>
         </w:trPr>
         <w:tc>
@@ -5405,7 +5405,7 @@
       </w:tr>
       <w:tr>
         <w:trPr>
-          <w:trHeight w:hRule="exact" w:val="425"/>
+          <w:trHeight w:hRule="atLeast" w:val="425"/>
           <w:jc w:val="center"/>
         </w:trPr>
         <w:tc>
@@ -5528,7 +5528,7 @@
       </w:tr>
       <w:tr>
         <w:trPr>
-          <w:trHeight w:hRule="exact" w:val="425"/>
+          <w:trHeight w:hRule="atLeast" w:val="425"/>
           <w:jc w:val="center"/>
         </w:trPr>
         <w:tc>
@@ -5651,7 +5651,7 @@
       </w:tr>
       <w:tr>
         <w:trPr>
-          <w:trHeight w:hRule="exact" w:val="425"/>
+          <w:trHeight w:hRule="atLeast" w:val="425"/>
           <w:jc w:val="center"/>
         </w:trPr>
         <w:tc>
@@ -5774,7 +5774,7 @@
       </w:tr>
       <w:tr>
         <w:trPr>
-          <w:trHeight w:hRule="exact" w:val="425"/>
+          <w:trHeight w:hRule="atLeast" w:val="425"/>
           <w:jc w:val="center"/>
         </w:trPr>
         <w:tc>
@@ -5897,7 +5897,7 @@
       </w:tr>
       <w:tr>
         <w:trPr>
-          <w:trHeight w:hRule="exact" w:val="425"/>
+          <w:trHeight w:hRule="atLeast" w:val="425"/>
           <w:jc w:val="center"/>
         </w:trPr>
         <w:tc>
@@ -6020,7 +6020,7 @@
       </w:tr>
       <w:tr>
         <w:trPr>
-          <w:trHeight w:hRule="exact" w:val="425"/>
+          <w:trHeight w:hRule="atLeast" w:val="425"/>
           <w:jc w:val="center"/>
         </w:trPr>
         <w:tc>
@@ -6143,7 +6143,7 @@
       </w:tr>
       <w:tr>
         <w:trPr>
-          <w:trHeight w:hRule="exact" w:val="425"/>
+          <w:trHeight w:hRule="atLeast" w:val="425"/>
           <w:jc w:val="center"/>
         </w:trPr>
         <w:tc>
@@ -6266,7 +6266,7 @@
       </w:tr>
       <w:tr>
         <w:trPr>
-          <w:trHeight w:hRule="exact" w:val="425"/>
+          <w:trHeight w:hRule="atLeast" w:val="425"/>
           <w:jc w:val="center"/>
         </w:trPr>
         <w:tc>
@@ -6389,7 +6389,7 @@
       </w:tr>
       <w:tr>
         <w:trPr>
-          <w:trHeight w:hRule="exact" w:val="425"/>
+          <w:trHeight w:hRule="atLeast" w:val="425"/>
           <w:jc w:val="center"/>
         </w:trPr>
         <w:tc>
@@ -6512,7 +6512,7 @@
       </w:tr>
       <w:tr>
         <w:trPr>
-          <w:trHeight w:hRule="exact" w:val="425"/>
+          <w:trHeight w:hRule="atLeast" w:val="425"/>
           <w:jc w:val="center"/>
         </w:trPr>
         <w:tc>
@@ -6635,7 +6635,7 @@
       </w:tr>
       <w:tr>
         <w:trPr>
-          <w:trHeight w:hRule="exact" w:val="425"/>
+          <w:trHeight w:hRule="atLeast" w:val="425"/>
           <w:jc w:val="center"/>
         </w:trPr>
         <w:tc>
@@ -6758,7 +6758,7 @@
       </w:tr>
       <w:tr>
         <w:trPr>
-          <w:trHeight w:hRule="exact" w:val="425"/>
+          <w:trHeight w:hRule="atLeast" w:val="425"/>
           <w:jc w:val="center"/>
         </w:trPr>
         <w:tc>
@@ -6881,7 +6881,7 @@
       </w:tr>
       <w:tr>
         <w:trPr>
-          <w:trHeight w:hRule="exact" w:val="425"/>
+          <w:trHeight w:hRule="atLeast" w:val="425"/>
           <w:jc w:val="center"/>
         </w:trPr>
         <w:tc>
@@ -7004,7 +7004,7 @@
       </w:tr>
       <w:tr>
         <w:trPr>
-          <w:trHeight w:hRule="exact" w:val="425"/>
+          <w:trHeight w:hRule="atLeast" w:val="425"/>
           <w:jc w:val="center"/>
         </w:trPr>
         <w:tc>

</xml_diff>

<commit_message>
feat: Add tanggal_selesai placeholder to kartu penulisan skripsi
</commit_message>
<xml_diff>
--- a/src/templates/template_kartu_penulisan_skripsi.docx
+++ b/src/templates/template_kartu_penulisan_skripsi.docx
@@ -1014,10 +1014,45 @@
             <w:pPr>
               <w:spacing w:after="0"/>
               <w:rPr>
-                <w:sz w:val="24"/>
-                <w:szCs w:val="24"/>
-              </w:rPr>
-            </w:pPr>
+                <w:b/>
+                <w:bCs/>
+                <w:sz w:val="24"/>
+                <w:szCs w:val="24"/>
+                <w:u w:val="single"/>
+              </w:rPr>
+            </w:pPr>
+            <w:r>
+              <w:rPr>
+                <w:b/>
+                <w:bCs/>
+                <w:sz w:val="24"/>
+                <w:szCs w:val="24"/>
+                <w:u w:val="single"/>
+              </w:rPr>
+              <w:t>{{</w:t>
+            </w:r>
+            <w:proofErr w:type="spellStart"/>
+            <w:r>
+              <w:rPr>
+                <w:b/>
+                <w:bCs/>
+                <w:sz w:val="24"/>
+                <w:szCs w:val="24"/>
+                <w:u w:val="single"/>
+              </w:rPr>
+              <w:t>tanggal_selesai</w:t>
+            </w:r>
+            <w:proofErr w:type="spellEnd"/>
+            <w:r>
+              <w:rPr>
+                <w:b/>
+                <w:bCs/>
+                <w:sz w:val="24"/>
+                <w:szCs w:val="24"/>
+                <w:u w:val="single"/>
+              </w:rPr>
+              <w:t>}}</w:t>
+            </w:r>
           </w:p>
         </w:tc>
       </w:tr>
@@ -1339,7 +1374,7 @@
       </w:tblGrid>
       <w:tr>
         <w:trPr>
-          <w:trHeight w:hRule="atLeast" w:val="369"/>
+          <w:trHeight w:val="369"/>
           <w:jc w:val="center"/>
         </w:trPr>
         <w:tc>
@@ -1417,7 +1452,7 @@
       </w:tr>
       <w:tr>
         <w:trPr>
-          <w:trHeight w:hRule="atLeast" w:val="425"/>
+          <w:trHeight w:val="425"/>
           <w:jc w:val="center"/>
         </w:trPr>
         <w:tc>
@@ -1495,7 +1530,7 @@
       </w:tr>
       <w:tr>
         <w:trPr>
-          <w:trHeight w:hRule="atLeast" w:val="425"/>
+          <w:trHeight w:val="425"/>
           <w:jc w:val="center"/>
         </w:trPr>
         <w:tc>
@@ -1573,7 +1608,7 @@
       </w:tr>
       <w:tr>
         <w:trPr>
-          <w:trHeight w:hRule="atLeast" w:val="425"/>
+          <w:trHeight w:val="425"/>
           <w:jc w:val="center"/>
         </w:trPr>
         <w:tc>
@@ -1651,7 +1686,7 @@
       </w:tr>
       <w:tr>
         <w:trPr>
-          <w:trHeight w:hRule="atLeast" w:val="425"/>
+          <w:trHeight w:val="425"/>
           <w:jc w:val="center"/>
         </w:trPr>
         <w:tc>
@@ -1729,7 +1764,7 @@
       </w:tr>
       <w:tr>
         <w:trPr>
-          <w:trHeight w:hRule="atLeast" w:val="425"/>
+          <w:trHeight w:val="425"/>
           <w:jc w:val="center"/>
         </w:trPr>
         <w:tc>
@@ -1807,7 +1842,7 @@
       </w:tr>
       <w:tr>
         <w:trPr>
-          <w:trHeight w:hRule="atLeast" w:val="425"/>
+          <w:trHeight w:val="425"/>
           <w:jc w:val="center"/>
         </w:trPr>
         <w:tc>
@@ -1885,7 +1920,7 @@
       </w:tr>
       <w:tr>
         <w:trPr>
-          <w:trHeight w:hRule="atLeast" w:val="425"/>
+          <w:trHeight w:val="425"/>
           <w:jc w:val="center"/>
         </w:trPr>
         <w:tc>
@@ -1963,7 +1998,7 @@
       </w:tr>
       <w:tr>
         <w:trPr>
-          <w:trHeight w:hRule="atLeast" w:val="425"/>
+          <w:trHeight w:val="425"/>
           <w:jc w:val="center"/>
         </w:trPr>
         <w:tc>
@@ -2041,7 +2076,7 @@
       </w:tr>
       <w:tr>
         <w:trPr>
-          <w:trHeight w:hRule="atLeast" w:val="425"/>
+          <w:trHeight w:val="425"/>
           <w:jc w:val="center"/>
         </w:trPr>
         <w:tc>
@@ -2119,7 +2154,7 @@
       </w:tr>
       <w:tr>
         <w:trPr>
-          <w:trHeight w:hRule="atLeast" w:val="425"/>
+          <w:trHeight w:val="425"/>
           <w:jc w:val="center"/>
         </w:trPr>
         <w:tc>
@@ -2197,7 +2232,7 @@
       </w:tr>
       <w:tr>
         <w:trPr>
-          <w:trHeight w:hRule="atLeast" w:val="425"/>
+          <w:trHeight w:val="425"/>
           <w:jc w:val="center"/>
         </w:trPr>
         <w:tc>
@@ -2275,7 +2310,7 @@
       </w:tr>
       <w:tr>
         <w:trPr>
-          <w:trHeight w:hRule="atLeast" w:val="425"/>
+          <w:trHeight w:val="425"/>
           <w:jc w:val="center"/>
         </w:trPr>
         <w:tc>
@@ -2353,7 +2388,7 @@
       </w:tr>
       <w:tr>
         <w:trPr>
-          <w:trHeight w:hRule="atLeast" w:val="425"/>
+          <w:trHeight w:val="425"/>
           <w:jc w:val="center"/>
         </w:trPr>
         <w:tc>
@@ -2431,7 +2466,7 @@
       </w:tr>
       <w:tr>
         <w:trPr>
-          <w:trHeight w:hRule="atLeast" w:val="425"/>
+          <w:trHeight w:val="425"/>
           <w:jc w:val="center"/>
         </w:trPr>
         <w:tc>
@@ -2509,7 +2544,7 @@
       </w:tr>
       <w:tr>
         <w:trPr>
-          <w:trHeight w:hRule="atLeast" w:val="425"/>
+          <w:trHeight w:val="425"/>
           <w:jc w:val="center"/>
         </w:trPr>
         <w:tc>
@@ -2587,7 +2622,7 @@
       </w:tr>
       <w:tr>
         <w:trPr>
-          <w:trHeight w:hRule="atLeast" w:val="425"/>
+          <w:trHeight w:val="425"/>
           <w:jc w:val="center"/>
         </w:trPr>
         <w:tc>
@@ -2665,7 +2700,7 @@
       </w:tr>
       <w:tr>
         <w:trPr>
-          <w:trHeight w:hRule="atLeast" w:val="425"/>
+          <w:trHeight w:val="425"/>
           <w:jc w:val="center"/>
         </w:trPr>
         <w:tc>
@@ -2743,7 +2778,7 @@
       </w:tr>
       <w:tr>
         <w:trPr>
-          <w:trHeight w:hRule="atLeast" w:val="425"/>
+          <w:trHeight w:val="425"/>
           <w:jc w:val="center"/>
         </w:trPr>
         <w:tc>
@@ -2821,7 +2856,7 @@
       </w:tr>
       <w:tr>
         <w:trPr>
-          <w:trHeight w:hRule="atLeast" w:val="425"/>
+          <w:trHeight w:val="425"/>
           <w:jc w:val="center"/>
         </w:trPr>
         <w:tc>
@@ -2945,7 +2980,7 @@
       </w:tr>
       <w:tr>
         <w:trPr>
-          <w:trHeight w:hRule="atLeast" w:val="425"/>
+          <w:trHeight w:val="425"/>
           <w:jc w:val="center"/>
         </w:trPr>
         <w:tc>
@@ -3068,7 +3103,7 @@
       </w:tr>
       <w:tr>
         <w:trPr>
-          <w:trHeight w:hRule="atLeast" w:val="425"/>
+          <w:trHeight w:val="425"/>
           <w:jc w:val="center"/>
         </w:trPr>
         <w:tc>
@@ -3191,7 +3226,7 @@
       </w:tr>
       <w:tr>
         <w:trPr>
-          <w:trHeight w:hRule="atLeast" w:val="425"/>
+          <w:trHeight w:val="425"/>
           <w:jc w:val="center"/>
         </w:trPr>
         <w:tc>
@@ -3314,7 +3349,7 @@
       </w:tr>
       <w:tr>
         <w:trPr>
-          <w:trHeight w:hRule="atLeast" w:val="425"/>
+          <w:trHeight w:val="425"/>
           <w:jc w:val="center"/>
         </w:trPr>
         <w:tc>
@@ -3437,7 +3472,7 @@
       </w:tr>
       <w:tr>
         <w:trPr>
-          <w:trHeight w:hRule="atLeast" w:val="425"/>
+          <w:trHeight w:val="425"/>
           <w:jc w:val="center"/>
         </w:trPr>
         <w:tc>
@@ -3560,7 +3595,7 @@
       </w:tr>
       <w:tr>
         <w:trPr>
-          <w:trHeight w:hRule="atLeast" w:val="425"/>
+          <w:trHeight w:val="425"/>
           <w:jc w:val="center"/>
         </w:trPr>
         <w:tc>
@@ -3683,7 +3718,7 @@
       </w:tr>
       <w:tr>
         <w:trPr>
-          <w:trHeight w:hRule="atLeast" w:val="425"/>
+          <w:trHeight w:val="425"/>
           <w:jc w:val="center"/>
         </w:trPr>
         <w:tc>
@@ -3806,7 +3841,7 @@
       </w:tr>
       <w:tr>
         <w:trPr>
-          <w:trHeight w:hRule="atLeast" w:val="425"/>
+          <w:trHeight w:val="425"/>
           <w:jc w:val="center"/>
         </w:trPr>
         <w:tc>
@@ -3929,7 +3964,7 @@
       </w:tr>
       <w:tr>
         <w:trPr>
-          <w:trHeight w:hRule="atLeast" w:val="425"/>
+          <w:trHeight w:val="425"/>
           <w:jc w:val="center"/>
         </w:trPr>
         <w:tc>
@@ -4052,7 +4087,7 @@
       </w:tr>
       <w:tr>
         <w:trPr>
-          <w:trHeight w:hRule="atLeast" w:val="425"/>
+          <w:trHeight w:val="425"/>
           <w:jc w:val="center"/>
         </w:trPr>
         <w:tc>
@@ -4175,7 +4210,7 @@
       </w:tr>
       <w:tr>
         <w:trPr>
-          <w:trHeight w:hRule="atLeast" w:val="425"/>
+          <w:trHeight w:val="425"/>
           <w:jc w:val="center"/>
         </w:trPr>
         <w:tc>
@@ -4298,7 +4333,7 @@
       </w:tr>
       <w:tr>
         <w:trPr>
-          <w:trHeight w:hRule="atLeast" w:val="425"/>
+          <w:trHeight w:val="425"/>
           <w:jc w:val="center"/>
         </w:trPr>
         <w:tc>
@@ -4421,7 +4456,7 @@
       </w:tr>
       <w:tr>
         <w:trPr>
-          <w:trHeight w:hRule="atLeast" w:val="425"/>
+          <w:trHeight w:val="425"/>
           <w:jc w:val="center"/>
         </w:trPr>
         <w:tc>
@@ -4544,7 +4579,7 @@
       </w:tr>
       <w:tr>
         <w:trPr>
-          <w:trHeight w:hRule="atLeast" w:val="425"/>
+          <w:trHeight w:val="425"/>
           <w:jc w:val="center"/>
         </w:trPr>
         <w:tc>
@@ -4667,7 +4702,7 @@
       </w:tr>
       <w:tr>
         <w:trPr>
-          <w:trHeight w:hRule="atLeast" w:val="425"/>
+          <w:trHeight w:val="425"/>
           <w:jc w:val="center"/>
         </w:trPr>
         <w:tc>
@@ -4790,7 +4825,7 @@
       </w:tr>
       <w:tr>
         <w:trPr>
-          <w:trHeight w:hRule="atLeast" w:val="425"/>
+          <w:trHeight w:val="425"/>
           <w:jc w:val="center"/>
         </w:trPr>
         <w:tc>
@@ -4913,7 +4948,7 @@
       </w:tr>
       <w:tr>
         <w:trPr>
-          <w:trHeight w:hRule="atLeast" w:val="425"/>
+          <w:trHeight w:val="425"/>
           <w:jc w:val="center"/>
         </w:trPr>
         <w:tc>
@@ -5036,7 +5071,7 @@
       </w:tr>
       <w:tr>
         <w:trPr>
-          <w:trHeight w:hRule="atLeast" w:val="425"/>
+          <w:trHeight w:val="425"/>
           <w:jc w:val="center"/>
         </w:trPr>
         <w:tc>
@@ -5159,7 +5194,7 @@
       </w:tr>
       <w:tr>
         <w:trPr>
-          <w:trHeight w:hRule="atLeast" w:val="425"/>
+          <w:trHeight w:val="425"/>
           <w:jc w:val="center"/>
         </w:trPr>
         <w:tc>
@@ -5282,7 +5317,7 @@
       </w:tr>
       <w:tr>
         <w:trPr>
-          <w:trHeight w:hRule="atLeast" w:val="425"/>
+          <w:trHeight w:val="425"/>
           <w:jc w:val="center"/>
         </w:trPr>
         <w:tc>
@@ -5405,7 +5440,7 @@
       </w:tr>
       <w:tr>
         <w:trPr>
-          <w:trHeight w:hRule="atLeast" w:val="425"/>
+          <w:trHeight w:val="425"/>
           <w:jc w:val="center"/>
         </w:trPr>
         <w:tc>
@@ -5528,7 +5563,7 @@
       </w:tr>
       <w:tr>
         <w:trPr>
-          <w:trHeight w:hRule="atLeast" w:val="425"/>
+          <w:trHeight w:val="425"/>
           <w:jc w:val="center"/>
         </w:trPr>
         <w:tc>
@@ -5651,7 +5686,7 @@
       </w:tr>
       <w:tr>
         <w:trPr>
-          <w:trHeight w:hRule="atLeast" w:val="425"/>
+          <w:trHeight w:val="425"/>
           <w:jc w:val="center"/>
         </w:trPr>
         <w:tc>
@@ -5774,7 +5809,7 @@
       </w:tr>
       <w:tr>
         <w:trPr>
-          <w:trHeight w:hRule="atLeast" w:val="425"/>
+          <w:trHeight w:val="425"/>
           <w:jc w:val="center"/>
         </w:trPr>
         <w:tc>
@@ -5897,7 +5932,7 @@
       </w:tr>
       <w:tr>
         <w:trPr>
-          <w:trHeight w:hRule="atLeast" w:val="425"/>
+          <w:trHeight w:val="425"/>
           <w:jc w:val="center"/>
         </w:trPr>
         <w:tc>
@@ -6020,7 +6055,7 @@
       </w:tr>
       <w:tr>
         <w:trPr>
-          <w:trHeight w:hRule="atLeast" w:val="425"/>
+          <w:trHeight w:val="425"/>
           <w:jc w:val="center"/>
         </w:trPr>
         <w:tc>
@@ -6143,7 +6178,7 @@
       </w:tr>
       <w:tr>
         <w:trPr>
-          <w:trHeight w:hRule="atLeast" w:val="425"/>
+          <w:trHeight w:val="425"/>
           <w:jc w:val="center"/>
         </w:trPr>
         <w:tc>
@@ -6266,7 +6301,7 @@
       </w:tr>
       <w:tr>
         <w:trPr>
-          <w:trHeight w:hRule="atLeast" w:val="425"/>
+          <w:trHeight w:val="425"/>
           <w:jc w:val="center"/>
         </w:trPr>
         <w:tc>
@@ -6389,7 +6424,7 @@
       </w:tr>
       <w:tr>
         <w:trPr>
-          <w:trHeight w:hRule="atLeast" w:val="425"/>
+          <w:trHeight w:val="425"/>
           <w:jc w:val="center"/>
         </w:trPr>
         <w:tc>
@@ -6512,7 +6547,7 @@
       </w:tr>
       <w:tr>
         <w:trPr>
-          <w:trHeight w:hRule="atLeast" w:val="425"/>
+          <w:trHeight w:val="425"/>
           <w:jc w:val="center"/>
         </w:trPr>
         <w:tc>
@@ -6635,7 +6670,7 @@
       </w:tr>
       <w:tr>
         <w:trPr>
-          <w:trHeight w:hRule="atLeast" w:val="425"/>
+          <w:trHeight w:val="425"/>
           <w:jc w:val="center"/>
         </w:trPr>
         <w:tc>
@@ -6758,7 +6793,7 @@
       </w:tr>
       <w:tr>
         <w:trPr>
-          <w:trHeight w:hRule="atLeast" w:val="425"/>
+          <w:trHeight w:val="425"/>
           <w:jc w:val="center"/>
         </w:trPr>
         <w:tc>
@@ -6881,7 +6916,7 @@
       </w:tr>
       <w:tr>
         <w:trPr>
-          <w:trHeight w:hRule="atLeast" w:val="425"/>
+          <w:trHeight w:val="425"/>
           <w:jc w:val="center"/>
         </w:trPr>
         <w:tc>
@@ -7004,7 +7039,7 @@
       </w:tr>
       <w:tr>
         <w:trPr>
-          <w:trHeight w:hRule="atLeast" w:val="425"/>
+          <w:trHeight w:val="425"/>
           <w:jc w:val="center"/>
         </w:trPr>
         <w:tc>

</xml_diff>